<commit_message>
Refine both AI resume variants
</commit_message>
<xml_diff>
--- a/resume/Stephen_Cho_AI_Systems_Resume.docx
+++ b/resume/Stephen_Cho_AI_Systems_Resume.docx
@@ -175,7 +175,7 @@
           <w:sz w:val="19"/>
           <w:spacing w:val="14"/>
         </w:rPr>
-        <w:t>EXPERIENCE</w:t>
+        <w:t>AI SYSTEMS &amp; PRODUCT</w:t>
       </w:r>
     </w:p>
     <w:p>
@@ -199,7 +199,7 @@
           <w:sz w:val="16"/>
           <w:spacing w:val="9"/>
         </w:rPr>
-        <w:t>SIGNATURE SYSTEM  —  TWO-LAYER FINANCIAL AI OPERATING SYSTEM  ·  FAIL-CLOSED</w:t>
+        <w:t>SIGNATURE SYSTEM  —  TWO-LAYER AGENTIC AI OPERATING SYSTEM  ·  FAIL-CLOSED</w:t>
       </w:r>
     </w:p>
     <w:p>
@@ -287,7 +287,7 @@
           <w:color w:val="171717"/>
           <w:sz w:val="19"/>
         </w:rPr>
-        <w:t xml:space="preserve">  Dashboards · Positions · Risk · Subledger - client-facing state, decisions, provenance, and audit context.</w:t>
+        <w:t xml:space="preserve">  Dashboards · Positions · Risk · Subledger — client-facing state, decisions, provenance, and audit context.</w:t>
       </w:r>
     </w:p>
     <w:p>
@@ -344,7 +344,7 @@
           <w:color w:val="171717"/>
           <w:sz w:val="19"/>
         </w:rPr>
-        <w:t xml:space="preserve">  Route · Authorize · Test · Promote / Recycle · Recover - the control plane for bounded agentic execution.</w:t>
+        <w:t xml:space="preserve">  Route · Authorize · Test · Promote / Recycle · Recover — the control plane for bounded agentic execution.</w:t>
       </w:r>
     </w:p>
     <w:p>
@@ -438,6 +438,263 @@
           <w:sz w:val="19"/>
         </w:rPr>
         <w:t>Built MongoDB ticket/claim ledgers, isolated Git worktrees, deterministic reduction, append-only telemetry, dashboards, rollback, and recovery.</w:t>
+      </w:r>
+    </w:p>
+    <w:p>
+      <w:pPr>
+        <w:pStyle w:val="ResumeCompany"/>
+        <w:keepNext/>
+        <w:keepLines w:val="0"/>
+        <w:widowControl/>
+        <w:tabs>
+          <w:tab w:pos="10368" w:val="right"/>
+        </w:tabs>
+        <w:spacing w:before="76" w:after="10" w:line="240" w:lineRule="auto"/>
+        <w:ind w:left="0" w:right="0"/>
+      </w:pPr>
+      <w:r>
+        <w:rPr>
+          <w:rFonts w:ascii="Georgia" w:hAnsi="Georgia" w:eastAsia="Georgia" w:cs="Georgia"/>
+          <w:b/>
+          <w:color w:val="171717"/>
+          <w:sz w:val="22"/>
+        </w:rPr>
+        <w:t>Keroro Travel</w:t>
+      </w:r>
+      <w:r>
+        <w:rPr>
+          <w:rFonts w:ascii="Consolas" w:hAnsi="Consolas" w:eastAsia="Consolas" w:cs="Consolas"/>
+          <w:b/>
+          <w:color w:val="6F6A63"/>
+          <w:sz w:val="17"/>
+        </w:rPr>
+        <w:tab/>
+        <w:t>Jul 2024 - Present</w:t>
+      </w:r>
+    </w:p>
+    <w:p>
+      <w:pPr>
+        <w:pStyle w:val="ResumeRole"/>
+        <w:keepNext/>
+        <w:keepLines w:val="0"/>
+        <w:widowControl/>
+        <w:spacing w:before="0" w:after="32" w:line="240" w:lineRule="auto"/>
+        <w:ind w:left="0" w:right="0"/>
+      </w:pPr>
+      <w:r>
+        <w:rPr>
+          <w:rFonts w:ascii="Segoe UI" w:hAnsi="Segoe UI" w:eastAsia="Segoe UI" w:cs="Segoe UI"/>
+          <w:color w:val="6F6A63"/>
+          <w:sz w:val="19"/>
+        </w:rPr>
+        <w:t>General Manager | Travel Technology &amp; Systems Architecture</w:t>
+      </w:r>
+    </w:p>
+    <w:p>
+      <w:pPr>
+        <w:numPr>
+          <w:ilvl w:val="0"/>
+          <w:numId w:val="10"/>
+        </w:numPr>
+        <w:pStyle w:val="ResumeBullet"/>
+        <w:keepNext w:val="0"/>
+        <w:keepLines/>
+        <w:widowControl/>
+        <w:spacing w:before="0" w:after="38" w:line="252" w:lineRule="auto"/>
+        <w:ind w:left="0" w:right="0"/>
+      </w:pPr>
+      <w:r>
+        <w:rPr>
+          <w:rFonts w:ascii="Segoe UI" w:hAnsi="Segoe UI" w:eastAsia="Segoe UI" w:cs="Segoe UI"/>
+          <w:color w:val="171717"/>
+          <w:sz w:val="19"/>
+        </w:rPr>
+        <w:t>Designed and built a full-stack travel-intelligence web platform (React, FastAPI, MongoDB) with an eight-language interface and an API-backed dataset of 621 curated wedding venues, creating the structured-data foundation for AI-assisted planning.</w:t>
+      </w:r>
+    </w:p>
+    <w:p>
+      <w:pPr>
+        <w:numPr>
+          <w:ilvl w:val="0"/>
+          <w:numId w:val="10"/>
+        </w:numPr>
+        <w:pStyle w:val="ResumeBullet"/>
+        <w:keepNext w:val="0"/>
+        <w:keepLines/>
+        <w:widowControl/>
+        <w:spacing w:before="0" w:after="20" w:line="252" w:lineRule="auto"/>
+        <w:ind w:left="0" w:right="0"/>
+      </w:pPr>
+      <w:r>
+        <w:rPr>
+          <w:rFonts w:ascii="Segoe UI" w:hAnsi="Segoe UI" w:eastAsia="Segoe UI" w:cs="Segoe UI"/>
+          <w:color w:val="171717"/>
+          <w:sz w:val="19"/>
+        </w:rPr>
+        <w:t>Architected integrations and operating workflows across Expedia TAAP, Fora, supplier platforms, client data, itinerary design, quoting, commissions, booking, and service delivery; built a tour-operator network and converted firsthand luxury-product research into client-ready itineraries.</w:t>
+      </w:r>
+    </w:p>
+    <w:p>
+      <w:pPr>
+        <w:pStyle w:val="Heading1"/>
+        <w:keepNext/>
+        <w:keepLines w:val="0"/>
+        <w:widowControl/>
+        <w:spacing w:before="60" w:after="76" w:line="240" w:lineRule="auto"/>
+        <w:ind w:left="0" w:right="0"/>
+        <w:pBdr>
+          <w:bottom w:val="single" w:sz="4" w:space="3" w:color="D8D0C3"/>
+        </w:pBdr>
+      </w:pPr>
+      <w:r>
+        <w:rPr>
+          <w:rFonts w:ascii="Georgia" w:hAnsi="Georgia" w:eastAsia="Georgia" w:cs="Georgia"/>
+          <w:color w:val="742735"/>
+          <w:sz w:val="35"/>
+        </w:rPr>
+        <w:t>02</w:t>
+      </w:r>
+      <w:r>
+        <w:rPr>
+          <w:rFonts w:ascii="Segoe UI Semibold" w:hAnsi="Segoe UI Semibold" w:eastAsia="Segoe UI Semibold" w:cs="Segoe UI Semibold"/>
+          <w:color w:val="B8A57C"/>
+          <w:sz w:val="18"/>
+        </w:rPr>
+        <w:t xml:space="preserve">  /  </w:t>
+      </w:r>
+      <w:r>
+        <w:rPr>
+          <w:rFonts w:ascii="Segoe UI Semibold" w:hAnsi="Segoe UI Semibold" w:eastAsia="Segoe UI Semibold" w:cs="Segoe UI Semibold"/>
+          <w:b/>
+          <w:color w:val="171717"/>
+          <w:sz w:val="19"/>
+          <w:spacing w:val="14"/>
+        </w:rPr>
+        <w:t>SYSTEMS &amp; DELIVERY</w:t>
+      </w:r>
+    </w:p>
+    <w:p>
+      <w:pPr>
+        <w:pStyle w:val="ResumeDetail"/>
+        <w:keepNext w:val="0"/>
+        <w:keepLines/>
+        <w:widowControl/>
+        <w:spacing w:before="0" w:after="34" w:line="257" w:lineRule="auto"/>
+        <w:ind w:left="0" w:right="0"/>
+        <w:pBdr>
+          <w:bottom w:val="single" w:sz="2" w:space="2" w:color="D8D0C3"/>
+        </w:pBdr>
+      </w:pPr>
+      <w:r>
+        <w:rPr>
+          <w:rFonts w:ascii="Georgia" w:hAnsi="Georgia" w:eastAsia="Georgia" w:cs="Georgia"/>
+          <w:color w:val="742735"/>
+          <w:sz w:val="20"/>
+        </w:rPr>
+        <w:t xml:space="preserve">AGENTIC PLATFORM  </w:t>
+      </w:r>
+      <w:r>
+        <w:rPr>
+          <w:rFonts w:ascii="Segoe UI" w:hAnsi="Segoe UI" w:eastAsia="Segoe UI" w:cs="Segoe UI"/>
+          <w:color w:val="171717"/>
+          <w:sz w:val="19"/>
+        </w:rPr>
+        <w:t>Python; MongoDB; REST/JSON; schema-defined tickets; claim ledgers; Git worktrees; deterministic reduction; telemetry; rollback.</w:t>
+      </w:r>
+    </w:p>
+    <w:p>
+      <w:pPr>
+        <w:pStyle w:val="ResumeDetail"/>
+        <w:keepNext w:val="0"/>
+        <w:keepLines/>
+        <w:widowControl/>
+        <w:spacing w:before="0" w:after="34" w:line="257" w:lineRule="auto"/>
+        <w:ind w:left="0" w:right="0"/>
+        <w:pBdr>
+          <w:bottom w:val="single" w:sz="2" w:space="2" w:color="D8D0C3"/>
+        </w:pBdr>
+      </w:pPr>
+      <w:r>
+        <w:rPr>
+          <w:rFonts w:ascii="Georgia" w:hAnsi="Georgia" w:eastAsia="Georgia" w:cs="Georgia"/>
+          <w:color w:val="742735"/>
+          <w:sz w:val="20"/>
+        </w:rPr>
+        <w:t xml:space="preserve">ENTERPRISE DELIVERY  </w:t>
+      </w:r>
+      <w:r>
+        <w:rPr>
+          <w:rFonts w:ascii="Segoe UI" w:hAnsi="Segoe UI" w:eastAsia="Segoe UI" w:cs="Segoe UI"/>
+          <w:color w:val="171717"/>
+          <w:sz w:val="19"/>
+        </w:rPr>
+        <w:t>Workflow mapping; integrations; release coordination; defect and incident triage; technical communication; cross-functional stakeholder alignment.</w:t>
+      </w:r>
+    </w:p>
+    <w:p>
+      <w:pPr>
+        <w:pStyle w:val="ResumeDetail"/>
+        <w:keepNext w:val="0"/>
+        <w:keepLines/>
+        <w:widowControl/>
+        <w:spacing w:before="0" w:after="52" w:line="257" w:lineRule="auto"/>
+        <w:ind w:left="0" w:right="0"/>
+      </w:pPr>
+      <w:r>
+        <w:rPr>
+          <w:rFonts w:ascii="Georgia" w:hAnsi="Georgia" w:eastAsia="Georgia" w:cs="Georgia"/>
+          <w:color w:val="742735"/>
+          <w:sz w:val="20"/>
+        </w:rPr>
+        <w:t xml:space="preserve">DOMAIN SYSTEMS  </w:t>
+      </w:r>
+      <w:r>
+        <w:rPr>
+          <w:rFonts w:ascii="Segoe UI" w:hAnsi="Segoe UI" w:eastAsia="Segoe UI" w:cs="Segoe UI"/>
+          <w:color w:val="171717"/>
+          <w:sz w:val="19"/>
+        </w:rPr>
+        <w:t>Front Arena; Calypso XVA/ERS; Bloomberg; FactSet; FIX; SQL; XML/XSL; scenario and risk workflows.</w:t>
+      </w:r>
+    </w:p>
+    <w:p>
+      <w:pPr>
+        <w:pStyle w:val="Heading1"/>
+        <w:keepNext/>
+        <w:keepLines w:val="0"/>
+        <w:pageBreakBefore/>
+        <w:widowControl/>
+        <w:spacing w:before="80" w:after="76" w:line="240" w:lineRule="auto"/>
+        <w:ind w:left="0" w:right="0"/>
+        <w:pBdr>
+          <w:bottom w:val="single" w:sz="4" w:space="3" w:color="D8D0C3"/>
+        </w:pBdr>
+      </w:pPr>
+      <w:r>
+        <w:rPr>
+          <w:rFonts w:ascii="Georgia" w:hAnsi="Georgia" w:eastAsia="Georgia" w:cs="Georgia"/>
+          <w:color w:val="742735"/>
+          <w:sz w:val="35"/>
+        </w:rPr>
+        <w:t>03</w:t>
+      </w:r>
+      <w:r>
+        <w:rPr>
+          <w:rFonts w:ascii="Segoe UI Semibold" w:hAnsi="Segoe UI Semibold" w:eastAsia="Segoe UI Semibold" w:cs="Segoe UI Semibold"/>
+          <w:color w:val="B8A57C"/>
+          <w:sz w:val="18"/>
+        </w:rPr>
+        <w:t xml:space="preserve">  /  </w:t>
+      </w:r>
+      <w:r>
+        <w:rPr>
+          <w:rFonts w:ascii="Segoe UI Semibold" w:hAnsi="Segoe UI Semibold" w:eastAsia="Segoe UI Semibold" w:cs="Segoe UI Semibold"/>
+          <w:b/>
+          <w:color w:val="171717"/>
+          <w:sz w:val="19"/>
+          <w:spacing w:val="14"/>
+        </w:rPr>
+        <w:t>GLOBAL TECHNOLOGY / OPERATIONS / MEDIA</w:t>
       </w:r>
     </w:p>
     <w:p>
@@ -703,9 +960,8 @@
         <w:pStyle w:val="Heading1"/>
         <w:keepNext/>
         <w:keepLines w:val="0"/>
-        <w:pageBreakBefore/>
         <w:widowControl/>
-        <w:spacing w:before="80" w:after="76" w:line="240" w:lineRule="auto"/>
+        <w:spacing w:before="72" w:after="76" w:line="240" w:lineRule="auto"/>
         <w:ind w:left="0" w:right="0"/>
         <w:pBdr>
           <w:bottom w:val="single" w:sz="4" w:space="3" w:color="D8D0C3"/>
@@ -717,7 +973,7 @@
           <w:color w:val="742735"/>
           <w:sz w:val="35"/>
         </w:rPr>
-        <w:t>01</w:t>
+        <w:t>04</w:t>
       </w:r>
       <w:r>
         <w:rPr>
@@ -735,140 +991,7 @@
           <w:sz w:val="19"/>
           <w:spacing w:val="14"/>
         </w:rPr>
-        <w:t>EXPERIENCE / CONTINUED</w:t>
-      </w:r>
-    </w:p>
-    <w:p>
-      <w:pPr>
-        <w:pStyle w:val="ResumeCompany"/>
-        <w:keepNext/>
-        <w:keepLines w:val="0"/>
-        <w:widowControl/>
-        <w:tabs>
-          <w:tab w:pos="10368" w:val="right"/>
-        </w:tabs>
-        <w:spacing w:before="40" w:after="10" w:line="240" w:lineRule="auto"/>
-        <w:ind w:left="0" w:right="0"/>
-      </w:pPr>
-      <w:r>
-        <w:rPr>
-          <w:rFonts w:ascii="Georgia" w:hAnsi="Georgia" w:eastAsia="Georgia" w:cs="Georgia"/>
-          <w:b/>
-          <w:color w:val="171717"/>
-          <w:sz w:val="22"/>
-        </w:rPr>
-        <w:t>Keroro Travel</w:t>
-      </w:r>
-      <w:r>
-        <w:rPr>
-          <w:rFonts w:ascii="Consolas" w:hAnsi="Consolas" w:eastAsia="Consolas" w:cs="Consolas"/>
-          <w:b/>
-          <w:color w:val="6F6A63"/>
-          <w:sz w:val="17"/>
-        </w:rPr>
-        <w:tab/>
-        <w:t>Jul 2024 - Present</w:t>
-      </w:r>
-    </w:p>
-    <w:p>
-      <w:pPr>
-        <w:pStyle w:val="ResumeRole"/>
-        <w:keepNext/>
-        <w:keepLines w:val="0"/>
-        <w:widowControl/>
-        <w:spacing w:before="0" w:after="32" w:line="240" w:lineRule="auto"/>
-        <w:ind w:left="0" w:right="0"/>
-      </w:pPr>
-      <w:r>
-        <w:rPr>
-          <w:rFonts w:ascii="Segoe UI" w:hAnsi="Segoe UI" w:eastAsia="Segoe UI" w:cs="Segoe UI"/>
-          <w:color w:val="6F6A63"/>
-          <w:sz w:val="19"/>
-        </w:rPr>
-        <w:t>General Manager | Travel Technology &amp; Systems Architecture</w:t>
-      </w:r>
-    </w:p>
-    <w:p>
-      <w:pPr>
-        <w:numPr>
-          <w:ilvl w:val="0"/>
-          <w:numId w:val="10"/>
-        </w:numPr>
-        <w:pStyle w:val="ResumeBullet"/>
-        <w:keepNext w:val="0"/>
-        <w:keepLines/>
-        <w:widowControl/>
-        <w:spacing w:before="0" w:after="38" w:line="252" w:lineRule="auto"/>
-        <w:ind w:left="0" w:right="0"/>
-      </w:pPr>
-      <w:r>
-        <w:rPr>
-          <w:rFonts w:ascii="Segoe UI" w:hAnsi="Segoe UI" w:eastAsia="Segoe UI" w:cs="Segoe UI"/>
-          <w:color w:val="171717"/>
-          <w:sz w:val="19"/>
-        </w:rPr>
-        <w:t>Designed the operating and integration architecture connecting Expedia TAAP, Fora, supplier platforms, itinerary design, client data, quoting, commissions, and service-delivery workflows.</w:t>
-      </w:r>
-    </w:p>
-    <w:p>
-      <w:pPr>
-        <w:numPr>
-          <w:ilvl w:val="0"/>
-          <w:numId w:val="10"/>
-        </w:numPr>
-        <w:pStyle w:val="ResumeBullet"/>
-        <w:keepNext w:val="0"/>
-        <w:keepLines/>
-        <w:widowControl/>
-        <w:spacing w:before="0" w:after="20" w:line="252" w:lineRule="auto"/>
-        <w:ind w:left="0" w:right="0"/>
-      </w:pPr>
-      <w:r>
-        <w:rPr>
-          <w:rFonts w:ascii="Segoe UI" w:hAnsi="Segoe UI" w:eastAsia="Segoe UI" w:cs="Segoe UI"/>
-          <w:color w:val="171717"/>
-          <w:sz w:val="19"/>
-        </w:rPr>
-        <w:t>Built tour-operator and destination-supplier relationships; evaluated luxury travel products firsthand and converted findings into curated itineraries, service standards, and client recommendations.</w:t>
-      </w:r>
-    </w:p>
-    <w:p>
-      <w:pPr>
-        <w:pStyle w:val="Heading1"/>
-        <w:keepNext/>
-        <w:keepLines w:val="0"/>
-        <w:widowControl/>
-        <w:spacing w:before="72" w:after="76" w:line="240" w:lineRule="auto"/>
-        <w:ind w:left="0" w:right="0"/>
-        <w:pBdr>
-          <w:bottom w:val="single" w:sz="4" w:space="3" w:color="D8D0C3"/>
-        </w:pBdr>
-      </w:pPr>
-      <w:r>
-        <w:rPr>
-          <w:rFonts w:ascii="Georgia" w:hAnsi="Georgia" w:eastAsia="Georgia" w:cs="Georgia"/>
-          <w:color w:val="742735"/>
-          <w:sz w:val="35"/>
-        </w:rPr>
-        <w:t>02</w:t>
-      </w:r>
-      <w:r>
-        <w:rPr>
-          <w:rFonts w:ascii="Segoe UI Semibold" w:hAnsi="Segoe UI Semibold" w:eastAsia="Segoe UI Semibold" w:cs="Segoe UI Semibold"/>
-          <w:color w:val="B8A57C"/>
-          <w:sz w:val="18"/>
-        </w:rPr>
-        <w:t xml:space="preserve">  /  </w:t>
-      </w:r>
-      <w:r>
-        <w:rPr>
-          <w:rFonts w:ascii="Segoe UI Semibold" w:hAnsi="Segoe UI Semibold" w:eastAsia="Segoe UI Semibold" w:cs="Segoe UI Semibold"/>
-          <w:b/>
-          <w:color w:val="171717"/>
-          <w:sz w:val="19"/>
-          <w:spacing w:val="14"/>
-        </w:rPr>
-        <w:t>CAPITAL MARKETS SYSTEMS / RISK FOUNDATION</w:t>
+        <w:t>ENTERPRISE SYSTEMS / RISK</w:t>
       </w:r>
     </w:p>
     <w:p>
@@ -940,7 +1063,7 @@
           <w:color w:val="171717"/>
           <w:sz w:val="19"/>
         </w:rPr>
-        <w:t>Protected monthly XVA/ERS release quality through manual regression and client-scenario tests, production-defect investigation in JIRA, service monitoring, and formal release reporting.</w:t>
+        <w:t>Validated monthly Calypso XVA/ERS releases through regression and client-scenario testing; investigated production defects in JIRA, monitored services and outputs, and documented release readiness.</w:t>
       </w:r>
     </w:p>
     <w:p>
@@ -962,7 +1085,7 @@
           <w:color w:val="171717"/>
           <w:sz w:val="19"/>
         </w:rPr>
-        <w:t>Diagnosed pricing, risk-valuation, and P&amp;L breaks across yield-curve, underlying-price, and FX shocks; supported implementations for HKEX, EUREX, MUFG, RBC, HSBC, AIB, Gazprom Bank, and Emirates NBD.</w:t>
+        <w:t>Diagnosed pricing, risk-valuation, and P&amp;L breaks across yield-curve, underlying-price, and FX shocks; supported implementation and release readiness for HKEX, EUREX, MUFG, RBC, HSBC, AIB, Gazprom Bank, and Emirates NBD.</w:t>
       </w:r>
     </w:p>
     <w:p>
@@ -1034,7 +1157,7 @@
           <w:color w:val="171717"/>
           <w:sz w:val="19"/>
         </w:rPr>
-        <w:t>Produced VaR, stress, liquidity, concentration, attribution, contribution-to-return, and monthly investor reporting for an approximately $500M Greater China hedge fund.</w:t>
+        <w:t>Owned independent risk and performance monitoring for an approximately $500M Greater China hedge fund, producing VaR, stress, liquidity, concentration, attribution, contribution-to-return, and monthly investor reporting.</w:t>
       </w:r>
     </w:p>
     <w:p>
@@ -1150,7 +1273,7 @@
           <w:color w:val="171717"/>
           <w:sz w:val="19"/>
         </w:rPr>
-        <w:t>Protected pricing, P&amp;L, end-of-day reporting, and pre-/post-trade controls by resolving yield-curve, volatility-surface, Greeks, structured-product, compliance, and risk-module issues.</w:t>
+        <w:t>Owned client-facing diagnosis and recovery for pricing, P&amp;L, risk, and end-of-day breaks across yield curves, volatility surfaces, Greeks, structured products, compliance, and risk modules.</w:t>
       </w:r>
     </w:p>
     <w:p>
@@ -1171,130 +1294,7 @@
           <w:color w:val="742735"/>
           <w:sz w:val="35"/>
         </w:rPr>
-        <w:t>03</w:t>
-      </w:r>
-      <w:r>
-        <w:rPr>
-          <w:rFonts w:ascii="Segoe UI Semibold" w:hAnsi="Segoe UI Semibold" w:eastAsia="Segoe UI Semibold" w:cs="Segoe UI Semibold"/>
-          <w:color w:val="B8A57C"/>
-          <w:sz w:val="18"/>
-        </w:rPr>
-        <w:t xml:space="preserve">  /  </w:t>
-      </w:r>
-      <w:r>
-        <w:rPr>
-          <w:rFonts w:ascii="Segoe UI Semibold" w:hAnsi="Segoe UI Semibold" w:eastAsia="Segoe UI Semibold" w:cs="Segoe UI Semibold"/>
-          <w:b/>
-          <w:color w:val="171717"/>
-          <w:sz w:val="19"/>
-          <w:spacing w:val="14"/>
-        </w:rPr>
-        <w:t>SYSTEMS &amp; DELIVERY</w:t>
-      </w:r>
-    </w:p>
-    <w:p>
-      <w:pPr>
-        <w:pStyle w:val="ResumeDetail"/>
-        <w:keepNext w:val="0"/>
-        <w:keepLines/>
-        <w:widowControl/>
-        <w:spacing w:before="0" w:after="34" w:line="257" w:lineRule="auto"/>
-        <w:ind w:left="0" w:right="0"/>
-        <w:pBdr>
-          <w:bottom w:val="single" w:sz="2" w:space="2" w:color="D8D0C3"/>
-        </w:pBdr>
-      </w:pPr>
-      <w:r>
-        <w:rPr>
-          <w:rFonts w:ascii="Georgia" w:hAnsi="Georgia" w:eastAsia="Georgia" w:cs="Georgia"/>
-          <w:color w:val="742735"/>
-          <w:sz w:val="20"/>
-        </w:rPr>
-        <w:t xml:space="preserve">AGENTIC PLATFORM  </w:t>
-      </w:r>
-      <w:r>
-        <w:rPr>
-          <w:rFonts w:ascii="Segoe UI" w:hAnsi="Segoe UI" w:eastAsia="Segoe UI" w:cs="Segoe UI"/>
-          <w:color w:val="171717"/>
-          <w:sz w:val="19"/>
-        </w:rPr>
-        <w:t>Python; MongoDB; REST/JSON; schema-defined tickets; claim ledgers; Git worktrees; deterministic reduction; telemetry; rollback.</w:t>
-      </w:r>
-    </w:p>
-    <w:p>
-      <w:pPr>
-        <w:pStyle w:val="ResumeDetail"/>
-        <w:keepNext w:val="0"/>
-        <w:keepLines/>
-        <w:widowControl/>
-        <w:spacing w:before="0" w:after="34" w:line="257" w:lineRule="auto"/>
-        <w:ind w:left="0" w:right="0"/>
-        <w:pBdr>
-          <w:bottom w:val="single" w:sz="2" w:space="2" w:color="D8D0C3"/>
-        </w:pBdr>
-      </w:pPr>
-      <w:r>
-        <w:rPr>
-          <w:rFonts w:ascii="Georgia" w:hAnsi="Georgia" w:eastAsia="Georgia" w:cs="Georgia"/>
-          <w:color w:val="742735"/>
-          <w:sz w:val="20"/>
-        </w:rPr>
-        <w:t xml:space="preserve">ENTERPRISE DELIVERY  </w:t>
-      </w:r>
-      <w:r>
-        <w:rPr>
-          <w:rFonts w:ascii="Segoe UI" w:hAnsi="Segoe UI" w:eastAsia="Segoe UI" w:cs="Segoe UI"/>
-          <w:color w:val="171717"/>
-          <w:sz w:val="19"/>
-        </w:rPr>
-        <w:t>Workflow mapping; integrations; release coordination; defect and incident triage; technical communication; cross-functional stakeholder alignment.</w:t>
-      </w:r>
-    </w:p>
-    <w:p>
-      <w:pPr>
-        <w:pStyle w:val="ResumeDetail"/>
-        <w:keepNext w:val="0"/>
-        <w:keepLines/>
-        <w:widowControl/>
-        <w:spacing w:before="0" w:after="52" w:line="257" w:lineRule="auto"/>
-        <w:ind w:left="0" w:right="0"/>
-      </w:pPr>
-      <w:r>
-        <w:rPr>
-          <w:rFonts w:ascii="Georgia" w:hAnsi="Georgia" w:eastAsia="Georgia" w:cs="Georgia"/>
-          <w:color w:val="742735"/>
-          <w:sz w:val="20"/>
-        </w:rPr>
-        <w:t xml:space="preserve">DOMAIN SYSTEMS  </w:t>
-      </w:r>
-      <w:r>
-        <w:rPr>
-          <w:rFonts w:ascii="Segoe UI" w:hAnsi="Segoe UI" w:eastAsia="Segoe UI" w:cs="Segoe UI"/>
-          <w:color w:val="171717"/>
-          <w:sz w:val="19"/>
-        </w:rPr>
-        <w:t>Front Arena; Calypso XVA/ERS; Bloomberg; FactSet; FIX; SQL; XML/XSL; scenario and risk workflows.</w:t>
-      </w:r>
-    </w:p>
-    <w:p>
-      <w:pPr>
-        <w:pStyle w:val="Heading1"/>
-        <w:keepNext/>
-        <w:keepLines w:val="0"/>
-        <w:widowControl/>
-        <w:spacing w:before="60" w:after="76" w:line="240" w:lineRule="auto"/>
-        <w:ind w:left="0" w:right="0"/>
-        <w:pBdr>
-          <w:bottom w:val="single" w:sz="4" w:space="3" w:color="D8D0C3"/>
-        </w:pBdr>
-      </w:pPr>
-      <w:r>
-        <w:rPr>
-          <w:rFonts w:ascii="Georgia" w:hAnsi="Georgia" w:eastAsia="Georgia" w:cs="Georgia"/>
-          <w:color w:val="742735"/>
-          <w:sz w:val="35"/>
-        </w:rPr>
-        <w:t>04</w:t>
+        <w:t>05</w:t>
       </w:r>
       <w:r>
         <w:rPr>

</xml_diff>